<commit_message>
update rapport et journal de travail
</commit_message>
<xml_diff>
--- a/doc/Rapport de projet.docx
+++ b/doc/Rapport de projet.docx
@@ -3416,9 +3416,9 @@
       <w:pPr>
         <w:pStyle w:val="Titre2"/>
       </w:pPr>
-      <w:bookmarkStart w:id="3" w:name="_Toc532179969"/>
-      <w:bookmarkStart w:id="4" w:name="_Toc165969639"/>
-      <w:bookmarkStart w:id="5" w:name="_Toc308526317"/>
+      <w:bookmarkStart w:id="3" w:name="_Toc308526317"/>
+      <w:bookmarkStart w:id="4" w:name="_Toc532179969"/>
+      <w:bookmarkStart w:id="5" w:name="_Toc165969639"/>
       <w:r>
         <w:t>T</w:t>
       </w:r>
@@ -3428,7 +3428,7 @@
       <w:r>
         <w:t>e</w:t>
       </w:r>
-      <w:bookmarkEnd w:id="5"/>
+      <w:bookmarkEnd w:id="3"/>
     </w:p>
     <w:p>
       <w:pPr>
@@ -4010,8 +4010,8 @@
       <w:r>
         <w:t>Planification</w:t>
       </w:r>
-      <w:bookmarkEnd w:id="3"/>
       <w:bookmarkEnd w:id="4"/>
+      <w:bookmarkEnd w:id="5"/>
       <w:r>
         <w:t xml:space="preserve"> Initiale</w:t>
       </w:r>
@@ -4155,7 +4155,19 @@
         <w:ind w:left="708"/>
       </w:pPr>
       <w:r>
-        <w:t>Résultat : Test concluant</w:t>
+        <w:rPr>
+          <w:color w:val="00B050"/>
+        </w:rPr>
+        <w:t>Résultat</w:t>
+      </w:r>
+      <w:r>
+        <w:t> : Test concluant</w:t>
+      </w:r>
+      <w:r>
+        <w:t xml:space="preserve">, l’utilisateur peut afficher jusqu’à 5 villes </w:t>
+      </w:r>
+      <w:r>
+        <w:t>simultanément</w:t>
       </w:r>
     </w:p>
     <w:p>
@@ -4185,13 +4197,7 @@
         <w:ind w:left="708"/>
       </w:pPr>
       <w:r>
-        <w:t xml:space="preserve">Test </w:t>
-      </w:r>
-      <w:r>
-        <w:t>d’acceptance :</w:t>
-      </w:r>
-      <w:r>
-        <w:t xml:space="preserve"> Quand j’affiche 2010+2011, la courbe est continue avec un léger marqueur à la jonction.</w:t>
+        <w:t>Test d’acceptance : Quand j’affiche 2010+2011, la courbe est continue avec un léger marqueur à la jonction.</w:t>
       </w:r>
     </w:p>
     <w:p>
@@ -4204,7 +4210,16 @@
         <w:ind w:left="708"/>
       </w:pPr>
       <w:r>
-        <w:t>Résultat : Test concluant</w:t>
+        <w:rPr>
+          <w:color w:val="00B050"/>
+        </w:rPr>
+        <w:t>Résultat</w:t>
+      </w:r>
+      <w:r>
+        <w:t> : Test concluant</w:t>
+      </w:r>
+      <w:r>
+        <w:t>, les données continuent et une séparation montre le changement d’année</w:t>
       </w:r>
     </w:p>
     <w:p>
@@ -4258,7 +4273,16 @@
         <w:ind w:left="708"/>
       </w:pPr>
       <w:r>
-        <w:t>Résultat : Test concluant</w:t>
+        <w:rPr>
+          <w:color w:val="00B050"/>
+        </w:rPr>
+        <w:t>Résultat</w:t>
+      </w:r>
+      <w:r>
+        <w:t> : Test concluant</w:t>
+      </w:r>
+      <w:r>
+        <w:t>, l’utilisateur peut choisir les années voulu.</w:t>
       </w:r>
     </w:p>
     <w:p>
@@ -4301,10 +4325,13 @@
         <w:ind w:left="708"/>
       </w:pPr>
       <w:r>
-        <w:t xml:space="preserve">Résultat : </w:t>
-      </w:r>
-      <w:r>
-        <w:t>L’utilisateur peut choisir plusieurs séries en les cochant sans passer par un bouton « Afficher »</w:t>
+        <w:rPr>
+          <w:color w:val="00B050"/>
+        </w:rPr>
+        <w:t>Résultat</w:t>
+      </w:r>
+      <w:r>
+        <w:t> : L’utilisateur peut choisir plusieurs séries en les cochant sans passer par un bouton « Afficher »</w:t>
       </w:r>
     </w:p>
     <w:p>
@@ -4358,10 +4385,22 @@
         <w:ind w:left="708"/>
       </w:pPr>
       <w:r>
-        <w:t xml:space="preserve">Résultat : </w:t>
-      </w:r>
-      <w:r>
-        <w:t>L’utilisateur ne peut pas importer un csv via le forms mais en dur dans le code. Elle reste après redémarrage.</w:t>
+        <w:rPr>
+          <w:color w:val="00B050"/>
+        </w:rPr>
+        <w:t>Résultat</w:t>
+      </w:r>
+      <w:r>
+        <w:t xml:space="preserve"> : </w:t>
+      </w:r>
+      <w:r>
+        <w:t xml:space="preserve">L’utilisateur </w:t>
+      </w:r>
+      <w:r>
+        <w:t xml:space="preserve">peut charger un CSV uniquement si elle est valide. Les données restent après </w:t>
+      </w:r>
+      <w:r>
+        <w:t>redémarrage.</w:t>
       </w:r>
     </w:p>
     <w:p>
@@ -4406,11 +4445,39 @@
     </w:p>
     <w:p>
       <w:pPr>
+        <w:ind w:left="708"/>
+      </w:pPr>
+      <w:r>
+        <w:rPr>
+          <w:color w:val="00B050"/>
+        </w:rPr>
+        <w:t>Résultat</w:t>
+      </w:r>
+      <w:r>
+        <w:t> :</w:t>
+      </w:r>
+      <w:r>
+        <w:t xml:space="preserve"> Une liste avec choix permet de choisir l’intervalle entre Mois/Année</w:t>
+      </w:r>
+    </w:p>
+    <w:p>
+      <w:pPr>
+        <w:ind w:left="708"/>
+      </w:pPr>
+    </w:p>
+    <w:p>
+      <w:pPr>
+        <w:ind w:left="708"/>
+      </w:pPr>
+    </w:p>
+    <w:p>
+      <w:pPr>
         <w:pStyle w:val="Titre1"/>
       </w:pPr>
       <w:bookmarkStart w:id="26" w:name="_Toc165969653"/>
       <w:bookmarkStart w:id="27" w:name="_Toc308526342"/>
       <w:r>
+        <w:lastRenderedPageBreak/>
         <w:t>Conclusion</w:t>
       </w:r>
       <w:bookmarkEnd w:id="26"/>
@@ -4426,8 +4493,35 @@
     </w:p>
     <w:p>
       <w:pPr>
-        <w:pStyle w:val="Corpsdetexte"/>
-      </w:pPr>
+        <w:pStyle w:val="Retraitcorpsdetexte"/>
+      </w:pPr>
+      <w:r>
+        <w:t>Une utilisation drastique de l’IA a débuté à partir de la 5</w:t>
+      </w:r>
+      <w:r>
+        <w:rPr>
+          <w:vertAlign w:val="superscript"/>
+        </w:rPr>
+        <w:t>ème</w:t>
+      </w:r>
+      <w:r>
+        <w:t xml:space="preserve"> séquence. Les connaissance</w:t>
+      </w:r>
+      <w:r>
+        <w:t>s</w:t>
+      </w:r>
+      <w:r>
+        <w:t xml:space="preserve"> et la pratique n’étant </w:t>
+      </w:r>
+      <w:r>
+        <w:t>pas assez consolidées</w:t>
+      </w:r>
+      <w:r>
+        <w:t xml:space="preserve"> </w:t>
+      </w:r>
+      <w:r>
+        <w:t>lors des modules précédents font qu’il ne m’est pas possible au vu du temps donner de le faire sans aide d’une intelligence artificielle.</w:t>
+      </w:r>
     </w:p>
     <w:p>
       <w:pPr>
@@ -4446,83 +4540,22 @@
     </w:p>
     <w:p>
       <w:pPr>
-        <w:pStyle w:val="Informations"/>
-        <w:numPr>
-          <w:ilvl w:val="5"/>
-          <w:numId w:val="6"/>
-        </w:numPr>
-      </w:pPr>
-      <w:r>
-        <w:t xml:space="preserve">Il s’agit de reprendre point par point les fonctionnalités décrites dans les spécifications de départ </w:t>
-      </w:r>
-      <w:r>
-        <w:t>et de définir si elles sont atteintes ou pas, et pourquoi.</w:t>
-      </w:r>
-    </w:p>
-    <w:p>
-      <w:pPr>
-        <w:pStyle w:val="Informations"/>
-        <w:numPr>
-          <w:ilvl w:val="5"/>
-          <w:numId w:val="6"/>
-        </w:numPr>
-      </w:pPr>
-      <w:r>
-        <w:lastRenderedPageBreak/>
-        <w:t>Si ce n’est pas le cas, estimer</w:t>
-      </w:r>
-      <w:r>
-        <w:t xml:space="preserve"> en « % » ou en « temps supplémentaire » </w:t>
-      </w:r>
-      <w:r>
-        <w:t>le travail qu’il reste à accomplir pour terminer le tout.</w:t>
-      </w:r>
-    </w:p>
-    <w:p>
-      <w:pPr>
-        <w:pStyle w:val="Titre2"/>
+        <w:ind w:left="1134"/>
       </w:pPr>
       <w:bookmarkStart w:id="30" w:name="_Toc165969655"/>
       <w:bookmarkStart w:id="31" w:name="_Toc308526344"/>
       <w:r>
-        <w:t>Bilan de la planification</w:t>
-      </w:r>
+        <w:t>Seule la fonction « importer en JSON » n’est pas implémentée.</w:t>
+      </w:r>
+    </w:p>
+    <w:p>
+      <w:pPr>
+        <w:pStyle w:val="Titre2"/>
+      </w:pPr>
+      <w:bookmarkStart w:id="32" w:name="_Toc165969656"/>
+      <w:bookmarkStart w:id="33" w:name="_Toc308526345"/>
       <w:bookmarkEnd w:id="30"/>
       <w:bookmarkEnd w:id="31"/>
-    </w:p>
-    <w:p>
-      <w:pPr>
-        <w:pStyle w:val="Informations"/>
-        <w:numPr>
-          <w:ilvl w:val="5"/>
-          <w:numId w:val="7"/>
-        </w:numPr>
-      </w:pPr>
-      <w:r>
-        <w:t xml:space="preserve">Distinguer </w:t>
-      </w:r>
-      <w:r>
-        <w:t xml:space="preserve">et expliquer </w:t>
-      </w:r>
-      <w:r>
-        <w:t xml:space="preserve">les tâches qui ont généré des retards ou de l'avance dans la </w:t>
-      </w:r>
-      <w:r>
-        <w:t>gestion du</w:t>
-      </w:r>
-      <w:r>
-        <w:t xml:space="preserve"> projet.</w:t>
-      </w:r>
-      <w:r>
-        <w:t xml:space="preserve"> Indiquer les différence entre les planifications initiales et détaillées avec le journal de travail.</w:t>
-      </w:r>
-    </w:p>
-    <w:p>
-      <w:pPr>
-        <w:pStyle w:val="Titre2"/>
-      </w:pPr>
-      <w:bookmarkStart w:id="32" w:name="_Toc165969656"/>
-      <w:bookmarkStart w:id="33" w:name="_Toc308526345"/>
       <w:r>
         <w:t>Bilan personnel</w:t>
       </w:r>
@@ -4531,98 +4564,13 @@
     </w:p>
     <w:p>
       <w:pPr>
-        <w:pStyle w:val="Informations"/>
-        <w:numPr>
-          <w:ilvl w:val="5"/>
-          <w:numId w:val="7"/>
-        </w:numPr>
-      </w:pPr>
-      <w:r>
-        <w:t>Si c’était à refaire</w:t>
-      </w:r>
-      <w:r>
-        <w:t>:</w:t>
-      </w:r>
-    </w:p>
-    <w:p>
-      <w:pPr>
-        <w:pStyle w:val="Informations"/>
-        <w:numPr>
-          <w:ilvl w:val="6"/>
-          <w:numId w:val="7"/>
-        </w:numPr>
-      </w:pPr>
-      <w:r>
-        <w:t>Q</w:t>
-      </w:r>
-      <w:r>
-        <w:t xml:space="preserve">u’est-ce </w:t>
-      </w:r>
-      <w:r>
-        <w:t>qu’il faudrait garder</w:t>
-      </w:r>
-      <w:r>
-        <w:t> </w:t>
-      </w:r>
-      <w:r>
-        <w:t>? Les</w:t>
-      </w:r>
-      <w:r>
-        <w:t xml:space="preserve"> plus et les moins ?</w:t>
-      </w:r>
-    </w:p>
-    <w:p>
-      <w:pPr>
-        <w:pStyle w:val="Informations"/>
-        <w:numPr>
-          <w:ilvl w:val="6"/>
-          <w:numId w:val="7"/>
-        </w:numPr>
-      </w:pPr>
-      <w:r>
-        <w:t>Q</w:t>
-      </w:r>
-      <w:r>
-        <w:t xml:space="preserve">u’est-ce </w:t>
-      </w:r>
-      <w:r>
-        <w:t>qu’il faudrait gérer, réaliser ou traiter différemment ?</w:t>
-      </w:r>
-    </w:p>
-    <w:p>
-      <w:pPr>
-        <w:pStyle w:val="Informations"/>
-        <w:numPr>
-          <w:ilvl w:val="5"/>
-          <w:numId w:val="7"/>
-        </w:numPr>
-      </w:pPr>
-      <w:r>
-        <w:t>Qu’est que ce projet m’a appris ?</w:t>
-      </w:r>
-    </w:p>
-    <w:p>
-      <w:pPr>
-        <w:pStyle w:val="Informations"/>
-        <w:numPr>
-          <w:ilvl w:val="5"/>
-          <w:numId w:val="7"/>
-        </w:numPr>
-      </w:pPr>
-      <w:r>
-        <w:t>Suite à donner, améliorations souhaitables, …</w:t>
-      </w:r>
-    </w:p>
-    <w:p>
-      <w:pPr>
-        <w:pStyle w:val="Informations"/>
-        <w:numPr>
-          <w:ilvl w:val="5"/>
-          <w:numId w:val="7"/>
-        </w:numPr>
-      </w:pPr>
-      <w:r>
-        <w:t>Remerciements, signature, etc.</w:t>
+        <w:pStyle w:val="Retraitcorpsdetexte"/>
+      </w:pPr>
+      <w:r>
+        <w:t>Projet intéressant mais pas réalisable sans IA dans le temps donné dans la nouvelle ordonnance de formation. Les bases du c# n’étant pas assez consolidées pour le fonctionnelle</w:t>
+      </w:r>
+      <w:r>
+        <w:t>.</w:t>
       </w:r>
     </w:p>
     <w:p>
@@ -4643,184 +4591,82 @@
       <w:pPr>
         <w:pStyle w:val="Titre2"/>
       </w:pPr>
-      <w:bookmarkStart w:id="37" w:name="_Toc532179972"/>
-      <w:bookmarkStart w:id="38" w:name="_Toc165969658"/>
-      <w:bookmarkStart w:id="39" w:name="_Toc308526347"/>
-      <w:r>
-        <w:t>Journal de travail</w:t>
+      <w:bookmarkStart w:id="37" w:name="_Toc308526349"/>
+      <w:r>
+        <w:t>Webographie</w:t>
       </w:r>
       <w:bookmarkEnd w:id="37"/>
-      <w:bookmarkEnd w:id="38"/>
-      <w:bookmarkEnd w:id="39"/>
     </w:p>
     <w:p>
       <w:pPr>
         <w:pStyle w:val="Informations"/>
-        <w:numPr>
-          <w:ilvl w:val="5"/>
-          <w:numId w:val="8"/>
-        </w:numPr>
-      </w:pPr>
-      <w:r>
-        <w:t>Date, activité</w:t>
-      </w:r>
-      <w:r>
-        <w:t xml:space="preserve"> (description qui permet</w:t>
-      </w:r>
-      <w:r>
-        <w:t xml:space="preserve"> de reproduire le cheminement du projet)</w:t>
-      </w:r>
-      <w:r>
-        <w:t>, durée</w:t>
-      </w:r>
-      <w:r>
-        <w:t>, liens et références sur des documents externes</w:t>
-      </w:r>
-      <w:r>
-        <w:t>.</w:t>
-      </w:r>
-      <w:r>
-        <w:t xml:space="preserve"> Lorsqu’une activité de recherches a été entreprise, il convient d’énumérer ce qui a été trouvé, avec les références.</w:t>
-      </w:r>
-    </w:p>
-    <w:p>
-      <w:pPr>
-        <w:pStyle w:val="Titre2"/>
-      </w:pPr>
-      <w:bookmarkStart w:id="40" w:name="_Toc308526348"/>
-      <w:r>
-        <w:t>Bibliographie</w:t>
-      </w:r>
-      <w:bookmarkEnd w:id="40"/>
+        <w:ind w:left="2160"/>
+      </w:pPr>
+      <w:hyperlink r:id="rId12" w:history="1">
+        <w:r>
+          <w:rPr>
+            <w:rStyle w:val="Lienhypertexte"/>
+            <w:lang w:val="en-US"/>
+          </w:rPr>
+          <w:t>Effortlessly Handle CSV Files in C# with CSVHelper</w:t>
+        </w:r>
+      </w:hyperlink>
     </w:p>
     <w:p>
       <w:pPr>
         <w:pStyle w:val="Informations"/>
-        <w:numPr>
-          <w:ilvl w:val="5"/>
-          <w:numId w:val="8"/>
-        </w:numPr>
-      </w:pPr>
-      <w:r>
-        <w:t>Références des livres</w:t>
-      </w:r>
-      <w:r>
-        <w:t>, revues et publications</w:t>
-      </w:r>
-      <w:r>
-        <w:t xml:space="preserve"> u</w:t>
-      </w:r>
-      <w:r>
-        <w:t>tilisés durant le projet.</w:t>
-      </w:r>
-    </w:p>
-    <w:p>
-      <w:pPr>
-        <w:pStyle w:val="Titre2"/>
-      </w:pPr>
-      <w:bookmarkStart w:id="41" w:name="_Toc308526349"/>
-      <w:r>
-        <w:t>Webographie</w:t>
-      </w:r>
-      <w:bookmarkEnd w:id="41"/>
+        <w:ind w:left="2160"/>
+        <w:rPr>
+          <w:lang w:val="en-US"/>
+        </w:rPr>
+      </w:pPr>
+      <w:hyperlink r:id="rId13" w:history="1">
+        <w:r>
+          <w:rPr>
+            <w:rStyle w:val="Lienhypertexte"/>
+          </w:rPr>
+          <w:t>ScottPlot 5.0 Cookbook</w:t>
+        </w:r>
+      </w:hyperlink>
     </w:p>
     <w:p>
       <w:pPr>
         <w:pStyle w:val="Informations"/>
-        <w:numPr>
-          <w:ilvl w:val="5"/>
-          <w:numId w:val="8"/>
-        </w:numPr>
-      </w:pPr>
-      <w:r>
-        <w:t>Références des sites Internet consultés durant le projet.</w:t>
-      </w:r>
-    </w:p>
-    <w:p>
-      <w:pPr>
-        <w:pStyle w:val="Titre1"/>
-      </w:pPr>
-      <w:bookmarkStart w:id="42" w:name="_Toc308526350"/>
-      <w:r>
-        <w:t>Annexes</w:t>
-      </w:r>
-      <w:bookmarkEnd w:id="42"/>
+        <w:ind w:left="2160"/>
+        <w:rPr>
+          <w:lang w:val="en-US"/>
+        </w:rPr>
+      </w:pPr>
+      <w:hyperlink r:id="rId14" w:history="1">
+        <w:r>
+          <w:rPr>
+            <w:rStyle w:val="Lienhypertexte"/>
+            <w:lang w:val="en-US"/>
+          </w:rPr>
+          <w:t>performance - CSV Data Plotting Program in C# - Code Review Stack Exchange</w:t>
+        </w:r>
+      </w:hyperlink>
     </w:p>
     <w:p>
       <w:pPr>
         <w:pStyle w:val="Informations"/>
-        <w:numPr>
-          <w:ilvl w:val="5"/>
-          <w:numId w:val="8"/>
-        </w:numPr>
-      </w:pPr>
-      <w:r>
-        <w:t>Listing du code source (partiel ou, plus rarement complet)</w:t>
-      </w:r>
-    </w:p>
-    <w:p>
-      <w:pPr>
-        <w:pStyle w:val="Informations"/>
-        <w:numPr>
-          <w:ilvl w:val="5"/>
-          <w:numId w:val="8"/>
-        </w:numPr>
-      </w:pPr>
-      <w:r>
-        <w:t>Guide</w:t>
-      </w:r>
-      <w:r>
-        <w:t>(s)</w:t>
-      </w:r>
-      <w:r>
-        <w:t xml:space="preserve"> d’utilisation et/ou guide de l’administrateur</w:t>
-      </w:r>
-    </w:p>
-    <w:p>
-      <w:pPr>
-        <w:pStyle w:val="Informations"/>
-        <w:numPr>
-          <w:ilvl w:val="5"/>
-          <w:numId w:val="8"/>
-        </w:numPr>
-      </w:pPr>
-      <w:r>
-        <w:t>Etat ou</w:t>
-      </w:r>
-      <w:r>
-        <w:t xml:space="preserve"> « dump » </w:t>
-      </w:r>
-      <w:r>
-        <w:t xml:space="preserve">de la configuration </w:t>
-      </w:r>
-      <w:r>
-        <w:t>des équipements</w:t>
-      </w:r>
-      <w:r>
-        <w:t xml:space="preserve"> (routeur, switch, robot, etc.).</w:t>
-      </w:r>
-    </w:p>
-    <w:p>
-      <w:pPr>
-        <w:pStyle w:val="Informations"/>
-        <w:numPr>
-          <w:ilvl w:val="5"/>
-          <w:numId w:val="8"/>
-        </w:numPr>
-      </w:pPr>
-      <w:r>
-        <w:t>Extraits</w:t>
-      </w:r>
-      <w:r>
-        <w:t xml:space="preserve"> de catalogue, documentation de fabricant</w:t>
-      </w:r>
-      <w:r>
-        <w:t>, etc.</w:t>
-      </w:r>
+        <w:ind w:left="2160"/>
+        <w:rPr>
+          <w:lang w:val="en-US"/>
+        </w:rPr>
+      </w:pPr>
+      <w:hyperlink r:id="rId15" w:anchor="reading-a-csv-file" w:history="1">
+        <w:r>
+          <w:rPr>
+            <w:rStyle w:val="Lienhypertexte"/>
+          </w:rPr>
+          <w:t>Getting Started | CsvHelper</w:t>
+        </w:r>
+      </w:hyperlink>
     </w:p>
     <w:sectPr>
-      <w:headerReference w:type="default" r:id="rId12"/>
-      <w:footerReference w:type="default" r:id="rId13"/>
+      <w:headerReference w:type="default" r:id="rId16"/>
+      <w:footerReference w:type="default" r:id="rId17"/>
       <w:pgSz w:w="11906" w:h="16838" w:code="9"/>
       <w:pgMar w:top="1418" w:right="1418" w:bottom="1418" w:left="1418" w:header="709" w:footer="709" w:gutter="0"/>
       <w:cols w:space="708"/>
@@ -5287,7 +5133,7 @@
               <w:noProof/>
               <w:szCs w:val="16"/>
             </w:rPr>
-            <w:t>00.00.0000 00:00</w:t>
+            <w:t>06.10.2025 15:42</w:t>
           </w:r>
           <w:r>
             <w:rPr>
@@ -5499,7 +5345,7 @@
         <v:path o:extrusionok="f" gradientshapeok="t" o:connecttype="rect"/>
         <o:lock v:ext="edit" aspectratio="t"/>
       </v:shapetype>
-      <v:shape id="_x0000_i1277" type="#_x0000_t75" style="width:12pt;height:12pt" o:bullet="t">
+      <v:shape id="_x0000_i1075" type="#_x0000_t75" style="width:12pt;height:12pt" o:bullet="t">
         <v:imagedata r:id="rId1" o:title="BD10263_"/>
       </v:shape>
     </w:pict>
@@ -8197,30 +8043,6 @@
 </file>
 
 <file path=customXml/item1.xml><?xml version="1.0" encoding="utf-8"?>
-<p:properties xmlns:p="http://schemas.microsoft.com/office/2006/metadata/properties" xmlns:xsi="http://www.w3.org/2001/XMLSchema-instance" xmlns:pc="http://schemas.microsoft.com/office/infopath/2007/PartnerControls">
-  <documentManagement>
-    <lcf76f155ced4ddcb4097134ff3c332f xmlns="bf2f2df3-a963-4452-b0e7-67dabc627c35">
-      <Terms xmlns="http://schemas.microsoft.com/office/infopath/2007/PartnerControls"/>
-    </lcf76f155ced4ddcb4097134ff3c332f>
-    <TaxCatchAll xmlns="f7d9f5a6-831d-4621-8c77-cbcaf993e406" xsi:nil="true"/>
-  </documentManagement>
-</p:properties>
-</file>
-
-<file path=customXml/item2.xml><?xml version="1.0" encoding="utf-8"?>
-<b:Sources xmlns:b="http://schemas.openxmlformats.org/officeDocument/2006/bibliography" xmlns="http://schemas.openxmlformats.org/officeDocument/2006/bibliography" SelectedStyle="\APA.XSL" StyleName="APA"/>
-</file>
-
-<file path=customXml/item3.xml><?xml version="1.0" encoding="utf-8"?>
-<?mso-contentType ?>
-<FormTemplates xmlns="http://schemas.microsoft.com/sharepoint/v3/contenttype/forms">
-  <Display>DocumentLibraryForm</Display>
-  <Edit>DocumentLibraryForm</Edit>
-  <New>DocumentLibraryForm</New>
-</FormTemplates>
-</file>
-
-<file path=customXml/item4.xml><?xml version="1.0" encoding="utf-8"?>
 <ct:contentTypeSchema xmlns:ct="http://schemas.microsoft.com/office/2006/metadata/contentType" xmlns:ma="http://schemas.microsoft.com/office/2006/metadata/properties/metaAttributes" ct:_="" ma:_="" ma:contentTypeName="Document" ma:contentTypeID="0x0101001ABD9BFFC9E543439C53A2705AE306EF" ma:contentTypeVersion="14" ma:contentTypeDescription="Crée un document." ma:contentTypeScope="" ma:versionID="41827e22f0a2406195029f3799eac37d">
   <xsd:schema xmlns:xsd="http://www.w3.org/2001/XMLSchema" xmlns:xs="http://www.w3.org/2001/XMLSchema" xmlns:p="http://schemas.microsoft.com/office/2006/metadata/properties" xmlns:ns2="bf2f2df3-a963-4452-b0e7-67dabc627c35" xmlns:ns3="f7d9f5a6-831d-4621-8c77-cbcaf993e406" targetNamespace="http://schemas.microsoft.com/office/2006/metadata/properties" ma:root="true" ma:fieldsID="b5448764cb5439448d1ea8eff3aff90d" ns2:_="" ns3:_="">
     <xsd:import namespace="bf2f2df3-a963-4452-b0e7-67dabc627c35"/>
@@ -8449,34 +8271,31 @@
 </ct:contentTypeSchema>
 </file>
 
-<file path=customXml/itemProps1.xml><?xml version="1.0" encoding="utf-8"?>
-<ds:datastoreItem xmlns:ds="http://schemas.openxmlformats.org/officeDocument/2006/customXml" ds:itemID="{4181FC95-92B5-446F-AE57-E4A44C8C450C}">
-  <ds:schemaRefs>
-    <ds:schemaRef ds:uri="http://schemas.microsoft.com/office/2006/metadata/properties"/>
-    <ds:schemaRef ds:uri="http://schemas.microsoft.com/office/infopath/2007/PartnerControls"/>
-    <ds:schemaRef ds:uri="bf2f2df3-a963-4452-b0e7-67dabc627c35"/>
-    <ds:schemaRef ds:uri="f7d9f5a6-831d-4621-8c77-cbcaf993e406"/>
-  </ds:schemaRefs>
-</ds:datastoreItem>
+<file path=customXml/item2.xml><?xml version="1.0" encoding="utf-8"?>
+<?mso-contentType ?>
+<FormTemplates xmlns="http://schemas.microsoft.com/sharepoint/v3/contenttype/forms">
+  <Display>DocumentLibraryForm</Display>
+  <Edit>DocumentLibraryForm</Edit>
+  <New>DocumentLibraryForm</New>
+</FormTemplates>
 </file>
 
-<file path=customXml/itemProps2.xml><?xml version="1.0" encoding="utf-8"?>
-<ds:datastoreItem xmlns:ds="http://schemas.openxmlformats.org/officeDocument/2006/customXml" ds:itemID="{C8C35155-3E6A-4058-B6E4-303717845E3B}">
-  <ds:schemaRefs>
-    <ds:schemaRef ds:uri="http://schemas.openxmlformats.org/officeDocument/2006/bibliography"/>
-  </ds:schemaRefs>
-</ds:datastoreItem>
+<file path=customXml/item3.xml><?xml version="1.0" encoding="utf-8"?>
+<b:Sources xmlns:b="http://schemas.openxmlformats.org/officeDocument/2006/bibliography" xmlns="http://schemas.openxmlformats.org/officeDocument/2006/bibliography" SelectedStyle="\APA.XSL" StyleName="APA"/>
 </file>
 
-<file path=customXml/itemProps3.xml><?xml version="1.0" encoding="utf-8"?>
-<ds:datastoreItem xmlns:ds="http://schemas.openxmlformats.org/officeDocument/2006/customXml" ds:itemID="{DF8E7934-3F3A-4F32-A7D4-1B248DBE707D}">
-  <ds:schemaRefs>
-    <ds:schemaRef ds:uri="http://schemas.microsoft.com/sharepoint/v3/contenttype/forms"/>
-  </ds:schemaRefs>
-</ds:datastoreItem>
+<file path=customXml/item4.xml><?xml version="1.0" encoding="utf-8"?>
+<p:properties xmlns:p="http://schemas.microsoft.com/office/2006/metadata/properties" xmlns:xsi="http://www.w3.org/2001/XMLSchema-instance" xmlns:pc="http://schemas.microsoft.com/office/infopath/2007/PartnerControls">
+  <documentManagement>
+    <lcf76f155ced4ddcb4097134ff3c332f xmlns="bf2f2df3-a963-4452-b0e7-67dabc627c35">
+      <Terms xmlns="http://schemas.microsoft.com/office/infopath/2007/PartnerControls"/>
+    </lcf76f155ced4ddcb4097134ff3c332f>
+    <TaxCatchAll xmlns="f7d9f5a6-831d-4621-8c77-cbcaf993e406" xsi:nil="true"/>
+  </documentManagement>
+</p:properties>
 </file>
 
-<file path=customXml/itemProps4.xml><?xml version="1.0" encoding="utf-8"?>
+<file path=customXml/itemProps1.xml><?xml version="1.0" encoding="utf-8"?>
 <ds:datastoreItem xmlns:ds="http://schemas.openxmlformats.org/officeDocument/2006/customXml" ds:itemID="{81FE595B-3A92-4484-A585-A4037F0DA599}">
   <ds:schemaRefs>
     <ds:schemaRef ds:uri="http://schemas.microsoft.com/office/2006/metadata/contentType"/>
@@ -8493,4 +8312,31 @@
     <ds:schemaRef ds:uri="http://schemas.microsoft.com/internal/obd"/>
   </ds:schemaRefs>
 </ds:datastoreItem>
+</file>
+
+<file path=customXml/itemProps2.xml><?xml version="1.0" encoding="utf-8"?>
+<ds:datastoreItem xmlns:ds="http://schemas.openxmlformats.org/officeDocument/2006/customXml" ds:itemID="{DF8E7934-3F3A-4F32-A7D4-1B248DBE707D}">
+  <ds:schemaRefs>
+    <ds:schemaRef ds:uri="http://schemas.microsoft.com/sharepoint/v3/contenttype/forms"/>
+  </ds:schemaRefs>
+</ds:datastoreItem>
+</file>
+
+<file path=customXml/itemProps3.xml><?xml version="1.0" encoding="utf-8"?>
+<ds:datastoreItem xmlns:ds="http://schemas.openxmlformats.org/officeDocument/2006/customXml" ds:itemID="{C8C35155-3E6A-4058-B6E4-303717845E3B}">
+  <ds:schemaRefs>
+    <ds:schemaRef ds:uri="http://schemas.openxmlformats.org/officeDocument/2006/bibliography"/>
+  </ds:schemaRefs>
+</ds:datastoreItem>
+</file>
+
+<file path=customXml/itemProps4.xml><?xml version="1.0" encoding="utf-8"?>
+<ds:datastoreItem xmlns:ds="http://schemas.openxmlformats.org/officeDocument/2006/customXml" ds:itemID="{4181FC95-92B5-446F-AE57-E4A44C8C450C}">
+  <ds:schemaRefs>
+    <ds:schemaRef ds:uri="http://schemas.microsoft.com/office/2006/metadata/properties"/>
+    <ds:schemaRef ds:uri="http://schemas.microsoft.com/office/infopath/2007/PartnerControls"/>
+    <ds:schemaRef ds:uri="bf2f2df3-a963-4452-b0e7-67dabc627c35"/>
+    <ds:schemaRef ds:uri="f7d9f5a6-831d-4621-8c77-cbcaf993e406"/>
+  </ds:schemaRefs>
+</ds:datastoreItem>
 </file>
</xml_diff>